<commit_message>
Landmark photo covers: CSI-supplied Taj Mahal for India, licensed Wikimedia photos for others
fetch_cover_photo.py accepts only reuse-licensed Commons photos and records the
credit line, printed under the cover photo; the red map remains the fallback.

Co-Authored-By: Claude Opus 5.5 <noreply@anthropic.com>
Claude-Session: https://claude.ai/code/session_01ChEN58PbdXFZmwUoBZYBRb
</commit_message>
<xml_diff>
--- a/deliverables/India/India_Profile_DRAFT.docx
+++ b/deliverables/India/India_Profile_DRAFT.docx
@@ -24,7 +24,7 @@
       <w:r>
         <w:drawing>
           <wp:inline xmlns:a="http://schemas.openxmlformats.org/drawingml/2006/main" xmlns:pic="http://schemas.openxmlformats.org/drawingml/2006/picture">
-            <wp:extent cx="6188710" cy="2784920"/>
+            <wp:extent cx="6188710" cy="3482119"/>
             <wp:docPr id="1" name="Picture 1"/>
             <wp:cNvGraphicFramePr>
               <a:graphicFrameLocks noChangeAspect="1"/>
@@ -33,7 +33,7 @@
               <a:graphicData uri="http://schemas.openxmlformats.org/drawingml/2006/picture">
                 <pic:pic>
                   <pic:nvPicPr>
-                    <pic:cNvPr id="0" name="India_cover_map.png"/>
+                    <pic:cNvPr id="0" name="India.jpg"/>
                     <pic:cNvPicPr/>
                   </pic:nvPicPr>
                   <pic:blipFill>
@@ -45,7 +45,7 @@
                   <pic:spPr>
                     <a:xfrm>
                       <a:off x="0" y="0"/>
-                      <a:ext cx="6188710" cy="2784920"/>
+                      <a:ext cx="6188710" cy="3482119"/>
                     </a:xfrm>
                     <a:prstGeom prst="rect"/>
                   </pic:spPr>

</xml_diff>